<commit_message>
feat: checkbox (□/☑) auto-detection, radio-group validation, and sibling field dependency
- Auto-annotate □/☑/☒ as fillable zones in annotation workbench
- Add radio_group to ValidationRule for mutual-exclusion validation
- Detect checkbox toggle (□→☑) via character-level comparison
- Enforce exactly-one-selected constraint within each radio_group
- Sibling validation: checked → fields must have content; unchecked → fields must be empty
- Auto-detect □ zones and assign radio groups in generate_rules
- Re-sort validation results so failures always appear first

Co-Authored-By: Claude Opus 4.7 <noreply@anthropic.com>
</commit_message>
<xml_diff>
--- a/docs/模板/技术服务标准合同-调整版V4.docx
+++ b/docs/模板/技术服务标准合同-调整版V4.docx
@@ -527,19 +527,39 @@
       <w:pPr>
         <w:pStyle w:val="10"/>
         <w:rPr>
+          <w:rFonts w:hint="default"/>
           <w:highlight w:val="cyan"/>
-          <w:lang w:eastAsia="zh-CN"/>
-        </w:rPr>
-      </w:pPr>
-    </w:p>
-    <w:p>
-      <w:pPr>
-        <w:pStyle w:val="10"/>
-        <w:rPr>
+          <w:lang w:val="en-US" w:eastAsia="zh-CN"/>
+        </w:rPr>
+      </w:pPr>
+      <w:r>
+        <w:rPr>
+          <w:rFonts w:hint="eastAsia"/>
           <w:highlight w:val="cyan"/>
-          <w:lang w:eastAsia="zh-CN"/>
-        </w:rPr>
-      </w:pPr>
+          <w:lang w:val="en-US" w:eastAsia="zh-CN"/>
+        </w:rPr>
+        <w:t>______________________________________</w:t>
+      </w:r>
+    </w:p>
+    <w:p>
+      <w:pPr>
+        <w:pStyle w:val="10"/>
+        <w:rPr>
+          <w:rFonts w:hint="default"/>
+          <w:highlight w:val="cyan"/>
+          <w:lang w:val="en-US" w:eastAsia="zh-CN"/>
+        </w:rPr>
+      </w:pPr>
+      <w:r>
+        <w:rPr>
+          <w:rFonts w:hint="eastAsia"/>
+          <w:highlight w:val="cyan"/>
+          <w:lang w:val="en-US" w:eastAsia="zh-CN"/>
+        </w:rPr>
+        <w:t>______________________________________</w:t>
+      </w:r>
+      <w:bookmarkStart w:id="0" w:name="_GoBack"/>
+      <w:bookmarkEnd w:id="0"/>
     </w:p>
     <w:p>
       <w:pPr>
@@ -2422,12 +2442,6 @@
             <w:insideH w:val="single" w:color="auto" w:sz="4" w:space="0"/>
             <w:insideV w:val="single" w:color="auto" w:sz="4" w:space="0"/>
           </w:tblBorders>
-          <w:tblCellMar>
-            <w:top w:w="0" w:type="dxa"/>
-            <w:left w:w="108" w:type="dxa"/>
-            <w:bottom w:w="0" w:type="dxa"/>
-            <w:right w:w="108" w:type="dxa"/>
-          </w:tblCellMar>
         </w:tblPrEx>
         <w:tc>
           <w:tcPr>
@@ -2718,10 +2732,7 @@
       <w:permEnd w:id="12"/>
     </w:tbl>
     <w:p/>
-    <w:p>
-      <w:bookmarkStart w:id="0" w:name="_GoBack"/>
-      <w:bookmarkEnd w:id="0"/>
-    </w:p>
+    <w:p/>
     <w:sectPr>
       <w:pgSz w:w="11906" w:h="16838"/>
       <w:pgMar w:top="1440" w:right="1800" w:bottom="1440" w:left="1800" w:header="851" w:footer="992" w:gutter="0"/>
@@ -2896,7 +2907,7 @@
     <w:lsdException w:uiPriority="99" w:name="HTML Sample"/>
     <w:lsdException w:uiPriority="99" w:name="HTML Typewriter"/>
     <w:lsdException w:uiPriority="99" w:name="HTML Variable"/>
-    <w:lsdException w:uiPriority="99" w:name="Normal Table"/>
+    <w:lsdException w:qFormat="1" w:uiPriority="99" w:name="Normal Table"/>
     <w:lsdException w:uiPriority="99" w:name="annotation subject"/>
     <w:lsdException w:uiPriority="99" w:name="Table Simple 1"/>
     <w:lsdException w:uiPriority="99" w:name="Table Simple 2"/>
@@ -3067,6 +3078,7 @@
     <w:name w:val="Normal Table"/>
     <w:semiHidden/>
     <w:unhideWhenUsed/>
+    <w:qFormat/>
     <w:uiPriority w:val="99"/>
     <w:tblPr>
       <w:tblCellMar>
@@ -3375,7 +3387,7 @@
     <w:charset w:val="00"/>
     <w:family w:val="swiss"/>
     <w:pitch w:val="default"/>
-    <w:sig w:usb0="E4002EFF" w:usb1="C200247B" w:usb2="00000009" w:usb3="00000000" w:csb0="200001FF" w:csb1="00000000"/>
+    <w:sig w:usb0="E4002EFF" w:usb1="C000247B" w:usb2="00000009" w:usb3="00000000" w:csb0="200001FF" w:csb1="00000000"/>
   </w:font>
   <w:font w:name="等线">
     <w:panose1 w:val="02010600030101010101"/>
@@ -3389,7 +3401,6 @@
 
 <file path=word/glossary/settings.xml><?xml version="1.0" encoding="utf-8"?>
 <w:settings xmlns:mc="http://schemas.openxmlformats.org/markup-compatibility/2006" xmlns:o="urn:schemas-microsoft-com:office:office" xmlns:r="http://schemas.openxmlformats.org/officeDocument/2006/relationships" xmlns:m="http://schemas.openxmlformats.org/officeDocument/2006/math" xmlns:v="urn:schemas-microsoft-com:vml" xmlns:w10="urn:schemas-microsoft-com:office:word" xmlns:w="http://schemas.openxmlformats.org/wordprocessingml/2006/main" xmlns:w14="http://schemas.microsoft.com/office/word/2010/wordml" xmlns:sl="http://schemas.openxmlformats.org/schemaLibrary/2006/main" xmlns:wpsCustomData="http://www.wps.cn/officeDocument/2013/wpsCustomData" mc:Ignorable="w14">
-  <w:doNotDisplayPageBoundaries w:val="1"/>
   <w:bordersDoNotSurroundHeader w:val="1"/>
   <w:bordersDoNotSurroundFooter w:val="1"/>
   <w:defaultTabStop w:val="420"/>

</xml_diff>